<commit_message>
docs: fix Word summary review links and wording
</commit_message>
<xml_diff>
--- a/docs/ReproLab_feedback_followup_summary_2026-04-06.docx
+++ b/docs/ReproLab_feedback_followup_summary_2026-04-06.docx
@@ -64,7 +64,7 @@
         <w:pStyle w:val="ListBullet"/>
       </w:pPr>
       <w:r>
-        <w:t>Pathway-level evaluation: top-pathway Jaccard overlap and pathway-score Spearman correlation.</w:t>
+        <w:t>Pathway-level evaluation: pathway-score Spearman correlation and top-pathway overlap checks.</w:t>
       </w:r>
     </w:p>
     <w:p>
@@ -165,7 +165,7 @@
     </w:p>
     <w:p>
       <w:r>
-        <w:t>Methods below are ranked by a composite of gene-level and pathway-level stability metrics: Spearman log2FC, significant-gene Jaccard, top-pathway Jaccard, and pathway-score Spearman.</w:t>
+        <w:t>Methods below are ranked by a composite of gene-level and pathway-level stability metrics: Spearman log2FC, significant-gene Jaccard, pathway-score Spearman, and top-pathway overlap.</w:t>
       </w:r>
     </w:p>
     <w:tbl>
@@ -989,7 +989,7 @@
         <w:pStyle w:val="ListBullet"/>
       </w:pPr>
       <w:r>
-        <w:t>C:\Users\nanda\Downloads\ReproLab\scripts\geo_utility_proof.py</w:t>
+        <w:t>https://github.com/SID-6921/ReproLab/blob/main/scripts/geo_utility_proof.py</w:t>
       </w:r>
     </w:p>
     <w:p>
@@ -997,7 +997,7 @@
         <w:pStyle w:val="ListBullet"/>
       </w:pPr>
       <w:r>
-        <w:t>C:\Users\nanda\Downloads\ReproLab\results\benchmarks\utility_proof_results.json</w:t>
+        <w:t>https://github.com/SID-6921/ReproLab/blob/main/results/benchmarks/utility_proof_results.json</w:t>
       </w:r>
     </w:p>
     <w:p>
@@ -1005,7 +1005,15 @@
         <w:pStyle w:val="ListBullet"/>
       </w:pPr>
       <w:r>
-        <w:t>C:\Users\nanda\Downloads\ReproLab\results\robustness</w:t>
+        <w:t>https://github.com/SID-6921/ReproLab/tree/main/results/robustness</w:t>
+      </w:r>
+    </w:p>
+    <w:p>
+      <w:pPr>
+        <w:pStyle w:val="ListBullet"/>
+      </w:pPr>
+      <w:r>
+        <w:t>https://github.com/SID-6921/ReproLab/blob/main/docs/ReproLab_feedback_followup_summary_2026-04-06.docx</w:t>
       </w:r>
     </w:p>
     <w:sectPr>

</xml_diff>

<commit_message>
docs: refine pathway metric presentation in Word summary
</commit_message>
<xml_diff>
--- a/docs/ReproLab_feedback_followup_summary_2026-04-06.docx
+++ b/docs/ReproLab_feedback_followup_summary_2026-04-06.docx
@@ -9,7 +9,7 @@
       <w:r>
         <w:rPr>
           <w:b/>
-          <w:sz w:val="31"/>
+          <w:sz w:val="32"/>
         </w:rPr>
         <w:t>ReproLab Follow-Up Validation Summary</w:t>
       </w:r>
@@ -19,7 +19,7 @@
         <w:jc w:val="center"/>
       </w:pPr>
       <w:r>
-        <w:t>Expanded utility validation after team feedback | Generated 2026-04-06 08:50</w:t>
+        <w:t>Expanded utility validation after team feedback | Generated 2026-04-06 09:02</w:t>
       </w:r>
     </w:p>
     <w:p>
@@ -64,7 +64,7 @@
         <w:pStyle w:val="ListBullet"/>
       </w:pPr>
       <w:r>
-        <w:t>Pathway-level evaluation: pathway-score Spearman correlation and top-pathway overlap checks.</w:t>
+        <w:t>Pathway-level evaluation: pathway-score Spearman correlation with top-pathway overlap checks as a secondary sanity check.</w:t>
       </w:r>
     </w:p>
     <w:p>
@@ -152,7 +152,7 @@
         <w:pStyle w:val="ListBullet"/>
       </w:pPr>
       <w:r>
-        <w:t>The ComBat-like correction was not robust enough as a default method. In structured batch noise on GSE3037, Spearman fell to 0.350 despite stable pathway rankings.</w:t>
+        <w:t>The ComBat-like correction was not robust enough as a default method. In structured batch noise on GSE3037, Spearman fell to 0.350 despite relatively stable pathway-score ranking.</w:t>
       </w:r>
     </w:p>
     <w:p>
@@ -165,7 +165,7 @@
     </w:p>
     <w:p>
       <w:r>
-        <w:t>Methods below are ranked by a composite of gene-level and pathway-level stability metrics: Spearman log2FC, significant-gene Jaccard, pathway-score Spearman, and top-pathway overlap.</w:t>
+        <w:t>Methods below are ranked using the more informative stability signals: Spearman log2FC, significant-gene Jaccard, and pathway-score Spearman. Top-pathway Jaccard was tracked during the benchmark, but it often saturated at 1.0 with the current 14-pathway panel, so it is not shown as a primary comparison metric here.</w:t>
       </w:r>
     </w:p>
     <w:tbl>
@@ -175,19 +175,18 @@
         <w:tblLook w:firstColumn="1" w:firstRow="1" w:lastColumn="0" w:lastRow="0" w:noHBand="0" w:noVBand="1" w:val="04A0"/>
       </w:tblPr>
       <w:tblGrid>
-        <w:gridCol w:w="1242"/>
-        <w:gridCol w:w="1242"/>
-        <w:gridCol w:w="1242"/>
-        <w:gridCol w:w="1242"/>
-        <w:gridCol w:w="1242"/>
-        <w:gridCol w:w="1242"/>
-        <w:gridCol w:w="1242"/>
-        <w:gridCol w:w="1242"/>
+        <w:gridCol w:w="1419"/>
+        <w:gridCol w:w="1419"/>
+        <w:gridCol w:w="1419"/>
+        <w:gridCol w:w="1419"/>
+        <w:gridCol w:w="1419"/>
+        <w:gridCol w:w="1419"/>
+        <w:gridCol w:w="1419"/>
       </w:tblGrid>
       <w:tr>
         <w:tc>
           <w:tcPr>
-            <w:tcW w:type="dxa" w:w="1242"/>
+            <w:tcW w:type="dxa" w:w="1419"/>
           </w:tcPr>
           <w:p>
             <w:r>
@@ -197,7 +196,7 @@
         </w:tc>
         <w:tc>
           <w:tcPr>
-            <w:tcW w:type="dxa" w:w="1242"/>
+            <w:tcW w:type="dxa" w:w="1419"/>
           </w:tcPr>
           <w:p>
             <w:r>
@@ -207,7 +206,7 @@
         </w:tc>
         <w:tc>
           <w:tcPr>
-            <w:tcW w:type="dxa" w:w="1242"/>
+            <w:tcW w:type="dxa" w:w="1419"/>
           </w:tcPr>
           <w:p>
             <w:r>
@@ -217,7 +216,7 @@
         </w:tc>
         <w:tc>
           <w:tcPr>
-            <w:tcW w:type="dxa" w:w="1242"/>
+            <w:tcW w:type="dxa" w:w="1419"/>
           </w:tcPr>
           <w:p>
             <w:r>
@@ -227,7 +226,7 @@
         </w:tc>
         <w:tc>
           <w:tcPr>
-            <w:tcW w:type="dxa" w:w="1242"/>
+            <w:tcW w:type="dxa" w:w="1419"/>
           </w:tcPr>
           <w:p>
             <w:r>
@@ -237,17 +236,17 @@
         </w:tc>
         <w:tc>
           <w:tcPr>
-            <w:tcW w:type="dxa" w:w="1242"/>
+            <w:tcW w:type="dxa" w:w="1419"/>
           </w:tcPr>
           <w:p>
             <w:r>
-              <w:t>Pathway Jaccard</w:t>
+              <w:t>Pathway Score Spearman</w:t>
             </w:r>
           </w:p>
         </w:tc>
         <w:tc>
           <w:tcPr>
-            <w:tcW w:type="dxa" w:w="1242"/>
+            <w:tcW w:type="dxa" w:w="1419"/>
           </w:tcPr>
           <w:p>
             <w:r>
@@ -255,21 +254,11 @@
             </w:r>
           </w:p>
         </w:tc>
-        <w:tc>
-          <w:tcPr>
-            <w:tcW w:type="dxa" w:w="1242"/>
-          </w:tcPr>
-          <w:p>
-            <w:r>
-              <w:t>Composite</w:t>
-            </w:r>
-          </w:p>
-        </w:tc>
       </w:tr>
       <w:tr>
         <w:tc>
           <w:tcPr>
-            <w:tcW w:type="dxa" w:w="1242"/>
+            <w:tcW w:type="dxa" w:w="1419"/>
           </w:tcPr>
           <w:p>
             <w:r>
@@ -279,7 +268,7 @@
         </w:tc>
         <w:tc>
           <w:tcPr>
-            <w:tcW w:type="dxa" w:w="1242"/>
+            <w:tcW w:type="dxa" w:w="1419"/>
           </w:tcPr>
           <w:p>
             <w:r>
@@ -289,7 +278,7 @@
         </w:tc>
         <w:tc>
           <w:tcPr>
-            <w:tcW w:type="dxa" w:w="1242"/>
+            <w:tcW w:type="dxa" w:w="1419"/>
           </w:tcPr>
           <w:p>
             <w:r>
@@ -299,7 +288,7 @@
         </w:tc>
         <w:tc>
           <w:tcPr>
-            <w:tcW w:type="dxa" w:w="1242"/>
+            <w:tcW w:type="dxa" w:w="1419"/>
           </w:tcPr>
           <w:p>
             <w:r>
@@ -309,7 +298,7 @@
         </w:tc>
         <w:tc>
           <w:tcPr>
-            <w:tcW w:type="dxa" w:w="1242"/>
+            <w:tcW w:type="dxa" w:w="1419"/>
           </w:tcPr>
           <w:p>
             <w:r>
@@ -319,17 +308,17 @@
         </w:tc>
         <w:tc>
           <w:tcPr>
-            <w:tcW w:type="dxa" w:w="1242"/>
+            <w:tcW w:type="dxa" w:w="1419"/>
           </w:tcPr>
           <w:p>
             <w:r>
-              <w:t>1.000</w:t>
+              <w:t>0.999</w:t>
             </w:r>
           </w:p>
         </w:tc>
         <w:tc>
           <w:tcPr>
-            <w:tcW w:type="dxa" w:w="1242"/>
+            <w:tcW w:type="dxa" w:w="1419"/>
           </w:tcPr>
           <w:p>
             <w:r>
@@ -337,21 +326,11 @@
             </w:r>
           </w:p>
         </w:tc>
-        <w:tc>
-          <w:tcPr>
-            <w:tcW w:type="dxa" w:w="1242"/>
-          </w:tcPr>
-          <w:p>
-            <w:r>
-              <w:t>3.935</w:t>
-            </w:r>
-          </w:p>
-        </w:tc>
       </w:tr>
       <w:tr>
         <w:tc>
           <w:tcPr>
-            <w:tcW w:type="dxa" w:w="1242"/>
+            <w:tcW w:type="dxa" w:w="1419"/>
           </w:tcPr>
           <w:p>
             <w:r>
@@ -361,7 +340,7 @@
         </w:tc>
         <w:tc>
           <w:tcPr>
-            <w:tcW w:type="dxa" w:w="1242"/>
+            <w:tcW w:type="dxa" w:w="1419"/>
           </w:tcPr>
           <w:p>
             <w:r>
@@ -371,7 +350,7 @@
         </w:tc>
         <w:tc>
           <w:tcPr>
-            <w:tcW w:type="dxa" w:w="1242"/>
+            <w:tcW w:type="dxa" w:w="1419"/>
           </w:tcPr>
           <w:p>
             <w:r>
@@ -381,7 +360,7 @@
         </w:tc>
         <w:tc>
           <w:tcPr>
-            <w:tcW w:type="dxa" w:w="1242"/>
+            <w:tcW w:type="dxa" w:w="1419"/>
           </w:tcPr>
           <w:p>
             <w:r>
@@ -391,7 +370,7 @@
         </w:tc>
         <w:tc>
           <w:tcPr>
-            <w:tcW w:type="dxa" w:w="1242"/>
+            <w:tcW w:type="dxa" w:w="1419"/>
           </w:tcPr>
           <w:p>
             <w:r>
@@ -401,17 +380,17 @@
         </w:tc>
         <w:tc>
           <w:tcPr>
-            <w:tcW w:type="dxa" w:w="1242"/>
+            <w:tcW w:type="dxa" w:w="1419"/>
           </w:tcPr>
           <w:p>
             <w:r>
-              <w:t>1.000</w:t>
+              <w:t>0.999</w:t>
             </w:r>
           </w:p>
         </w:tc>
         <w:tc>
           <w:tcPr>
-            <w:tcW w:type="dxa" w:w="1242"/>
+            <w:tcW w:type="dxa" w:w="1419"/>
           </w:tcPr>
           <w:p>
             <w:r>
@@ -419,21 +398,11 @@
             </w:r>
           </w:p>
         </w:tc>
-        <w:tc>
-          <w:tcPr>
-            <w:tcW w:type="dxa" w:w="1242"/>
-          </w:tcPr>
-          <w:p>
-            <w:r>
-              <w:t>3.613</w:t>
-            </w:r>
-          </w:p>
-        </w:tc>
       </w:tr>
       <w:tr>
         <w:tc>
           <w:tcPr>
-            <w:tcW w:type="dxa" w:w="1242"/>
+            <w:tcW w:type="dxa" w:w="1419"/>
           </w:tcPr>
           <w:p>
             <w:r>
@@ -443,7 +412,7 @@
         </w:tc>
         <w:tc>
           <w:tcPr>
-            <w:tcW w:type="dxa" w:w="1242"/>
+            <w:tcW w:type="dxa" w:w="1419"/>
           </w:tcPr>
           <w:p>
             <w:r>
@@ -453,7 +422,7 @@
         </w:tc>
         <w:tc>
           <w:tcPr>
-            <w:tcW w:type="dxa" w:w="1242"/>
+            <w:tcW w:type="dxa" w:w="1419"/>
           </w:tcPr>
           <w:p>
             <w:r>
@@ -463,7 +432,7 @@
         </w:tc>
         <w:tc>
           <w:tcPr>
-            <w:tcW w:type="dxa" w:w="1242"/>
+            <w:tcW w:type="dxa" w:w="1419"/>
           </w:tcPr>
           <w:p>
             <w:r>
@@ -473,7 +442,7 @@
         </w:tc>
         <w:tc>
           <w:tcPr>
-            <w:tcW w:type="dxa" w:w="1242"/>
+            <w:tcW w:type="dxa" w:w="1419"/>
           </w:tcPr>
           <w:p>
             <w:r>
@@ -483,17 +452,17 @@
         </w:tc>
         <w:tc>
           <w:tcPr>
-            <w:tcW w:type="dxa" w:w="1242"/>
+            <w:tcW w:type="dxa" w:w="1419"/>
           </w:tcPr>
           <w:p>
             <w:r>
-              <w:t>1.000</w:t>
+              <w:t>0.995</w:t>
             </w:r>
           </w:p>
         </w:tc>
         <w:tc>
           <w:tcPr>
-            <w:tcW w:type="dxa" w:w="1242"/>
+            <w:tcW w:type="dxa" w:w="1419"/>
           </w:tcPr>
           <w:p>
             <w:r>
@@ -501,21 +470,11 @@
             </w:r>
           </w:p>
         </w:tc>
-        <w:tc>
-          <w:tcPr>
-            <w:tcW w:type="dxa" w:w="1242"/>
-          </w:tcPr>
-          <w:p>
-            <w:r>
-              <w:t>3.684</w:t>
-            </w:r>
-          </w:p>
-        </w:tc>
       </w:tr>
       <w:tr>
         <w:tc>
           <w:tcPr>
-            <w:tcW w:type="dxa" w:w="1242"/>
+            <w:tcW w:type="dxa" w:w="1419"/>
           </w:tcPr>
           <w:p>
             <w:r>
@@ -525,7 +484,7 @@
         </w:tc>
         <w:tc>
           <w:tcPr>
-            <w:tcW w:type="dxa" w:w="1242"/>
+            <w:tcW w:type="dxa" w:w="1419"/>
           </w:tcPr>
           <w:p>
             <w:r>
@@ -535,7 +494,7 @@
         </w:tc>
         <w:tc>
           <w:tcPr>
-            <w:tcW w:type="dxa" w:w="1242"/>
+            <w:tcW w:type="dxa" w:w="1419"/>
           </w:tcPr>
           <w:p>
             <w:r>
@@ -545,7 +504,7 @@
         </w:tc>
         <w:tc>
           <w:tcPr>
-            <w:tcW w:type="dxa" w:w="1242"/>
+            <w:tcW w:type="dxa" w:w="1419"/>
           </w:tcPr>
           <w:p>
             <w:r>
@@ -555,7 +514,7 @@
         </w:tc>
         <w:tc>
           <w:tcPr>
-            <w:tcW w:type="dxa" w:w="1242"/>
+            <w:tcW w:type="dxa" w:w="1419"/>
           </w:tcPr>
           <w:p>
             <w:r>
@@ -565,17 +524,17 @@
         </w:tc>
         <w:tc>
           <w:tcPr>
-            <w:tcW w:type="dxa" w:w="1242"/>
+            <w:tcW w:type="dxa" w:w="1419"/>
           </w:tcPr>
           <w:p>
             <w:r>
-              <w:t>1.000</w:t>
+              <w:t>0.990</w:t>
             </w:r>
           </w:p>
         </w:tc>
         <w:tc>
           <w:tcPr>
-            <w:tcW w:type="dxa" w:w="1242"/>
+            <w:tcW w:type="dxa" w:w="1419"/>
           </w:tcPr>
           <w:p>
             <w:r>
@@ -583,21 +542,11 @@
             </w:r>
           </w:p>
         </w:tc>
-        <w:tc>
-          <w:tcPr>
-            <w:tcW w:type="dxa" w:w="1242"/>
-          </w:tcPr>
-          <w:p>
-            <w:r>
-              <w:t>3.016</w:t>
-            </w:r>
-          </w:p>
-        </w:tc>
       </w:tr>
       <w:tr>
         <w:tc>
           <w:tcPr>
-            <w:tcW w:type="dxa" w:w="1242"/>
+            <w:tcW w:type="dxa" w:w="1419"/>
           </w:tcPr>
           <w:p>
             <w:r>
@@ -607,7 +556,7 @@
         </w:tc>
         <w:tc>
           <w:tcPr>
-            <w:tcW w:type="dxa" w:w="1242"/>
+            <w:tcW w:type="dxa" w:w="1419"/>
           </w:tcPr>
           <w:p>
             <w:r>
@@ -617,7 +566,7 @@
         </w:tc>
         <w:tc>
           <w:tcPr>
-            <w:tcW w:type="dxa" w:w="1242"/>
+            <w:tcW w:type="dxa" w:w="1419"/>
           </w:tcPr>
           <w:p>
             <w:r>
@@ -627,7 +576,7 @@
         </w:tc>
         <w:tc>
           <w:tcPr>
-            <w:tcW w:type="dxa" w:w="1242"/>
+            <w:tcW w:type="dxa" w:w="1419"/>
           </w:tcPr>
           <w:p>
             <w:r>
@@ -637,7 +586,7 @@
         </w:tc>
         <w:tc>
           <w:tcPr>
-            <w:tcW w:type="dxa" w:w="1242"/>
+            <w:tcW w:type="dxa" w:w="1419"/>
           </w:tcPr>
           <w:p>
             <w:r>
@@ -647,17 +596,17 @@
         </w:tc>
         <w:tc>
           <w:tcPr>
-            <w:tcW w:type="dxa" w:w="1242"/>
+            <w:tcW w:type="dxa" w:w="1419"/>
           </w:tcPr>
           <w:p>
             <w:r>
-              <w:t>1.000</w:t>
+              <w:t>0.997</w:t>
             </w:r>
           </w:p>
         </w:tc>
         <w:tc>
           <w:tcPr>
-            <w:tcW w:type="dxa" w:w="1242"/>
+            <w:tcW w:type="dxa" w:w="1419"/>
           </w:tcPr>
           <w:p>
             <w:r>
@@ -665,21 +614,11 @@
             </w:r>
           </w:p>
         </w:tc>
-        <w:tc>
-          <w:tcPr>
-            <w:tcW w:type="dxa" w:w="1242"/>
-          </w:tcPr>
-          <w:p>
-            <w:r>
-              <w:t>3.836</w:t>
-            </w:r>
-          </w:p>
-        </w:tc>
       </w:tr>
       <w:tr>
         <w:tc>
           <w:tcPr>
-            <w:tcW w:type="dxa" w:w="1242"/>
+            <w:tcW w:type="dxa" w:w="1419"/>
           </w:tcPr>
           <w:p>
             <w:r>
@@ -689,7 +628,7 @@
         </w:tc>
         <w:tc>
           <w:tcPr>
-            <w:tcW w:type="dxa" w:w="1242"/>
+            <w:tcW w:type="dxa" w:w="1419"/>
           </w:tcPr>
           <w:p>
             <w:r>
@@ -699,7 +638,7 @@
         </w:tc>
         <w:tc>
           <w:tcPr>
-            <w:tcW w:type="dxa" w:w="1242"/>
+            <w:tcW w:type="dxa" w:w="1419"/>
           </w:tcPr>
           <w:p>
             <w:r>
@@ -709,7 +648,7 @@
         </w:tc>
         <w:tc>
           <w:tcPr>
-            <w:tcW w:type="dxa" w:w="1242"/>
+            <w:tcW w:type="dxa" w:w="1419"/>
           </w:tcPr>
           <w:p>
             <w:r>
@@ -719,7 +658,7 @@
         </w:tc>
         <w:tc>
           <w:tcPr>
-            <w:tcW w:type="dxa" w:w="1242"/>
+            <w:tcW w:type="dxa" w:w="1419"/>
           </w:tcPr>
           <w:p>
             <w:r>
@@ -729,17 +668,17 @@
         </w:tc>
         <w:tc>
           <w:tcPr>
-            <w:tcW w:type="dxa" w:w="1242"/>
+            <w:tcW w:type="dxa" w:w="1419"/>
           </w:tcPr>
           <w:p>
             <w:r>
-              <w:t>1.000</w:t>
+              <w:t>0.997</w:t>
             </w:r>
           </w:p>
         </w:tc>
         <w:tc>
           <w:tcPr>
-            <w:tcW w:type="dxa" w:w="1242"/>
+            <w:tcW w:type="dxa" w:w="1419"/>
           </w:tcPr>
           <w:p>
             <w:r>
@@ -747,21 +686,11 @@
             </w:r>
           </w:p>
         </w:tc>
-        <w:tc>
-          <w:tcPr>
-            <w:tcW w:type="dxa" w:w="1242"/>
-          </w:tcPr>
-          <w:p>
-            <w:r>
-              <w:t>2.810</w:t>
-            </w:r>
-          </w:p>
-        </w:tc>
       </w:tr>
       <w:tr>
         <w:tc>
           <w:tcPr>
-            <w:tcW w:type="dxa" w:w="1242"/>
+            <w:tcW w:type="dxa" w:w="1419"/>
           </w:tcPr>
           <w:p>
             <w:r>
@@ -771,7 +700,7 @@
         </w:tc>
         <w:tc>
           <w:tcPr>
-            <w:tcW w:type="dxa" w:w="1242"/>
+            <w:tcW w:type="dxa" w:w="1419"/>
           </w:tcPr>
           <w:p>
             <w:r>
@@ -781,7 +710,7 @@
         </w:tc>
         <w:tc>
           <w:tcPr>
-            <w:tcW w:type="dxa" w:w="1242"/>
+            <w:tcW w:type="dxa" w:w="1419"/>
           </w:tcPr>
           <w:p>
             <w:r>
@@ -791,7 +720,7 @@
         </w:tc>
         <w:tc>
           <w:tcPr>
-            <w:tcW w:type="dxa" w:w="1242"/>
+            <w:tcW w:type="dxa" w:w="1419"/>
           </w:tcPr>
           <w:p>
             <w:r>
@@ -801,7 +730,7 @@
         </w:tc>
         <w:tc>
           <w:tcPr>
-            <w:tcW w:type="dxa" w:w="1242"/>
+            <w:tcW w:type="dxa" w:w="1419"/>
           </w:tcPr>
           <w:p>
             <w:r>
@@ -811,17 +740,17 @@
         </w:tc>
         <w:tc>
           <w:tcPr>
-            <w:tcW w:type="dxa" w:w="1242"/>
+            <w:tcW w:type="dxa" w:w="1419"/>
           </w:tcPr>
           <w:p>
             <w:r>
-              <w:t>1.000</w:t>
+              <w:t>0.998</w:t>
             </w:r>
           </w:p>
         </w:tc>
         <w:tc>
           <w:tcPr>
-            <w:tcW w:type="dxa" w:w="1242"/>
+            <w:tcW w:type="dxa" w:w="1419"/>
           </w:tcPr>
           <w:p>
             <w:r>
@@ -829,21 +758,11 @@
             </w:r>
           </w:p>
         </w:tc>
-        <w:tc>
-          <w:tcPr>
-            <w:tcW w:type="dxa" w:w="1242"/>
-          </w:tcPr>
-          <w:p>
-            <w:r>
-              <w:t>3.568</w:t>
-            </w:r>
-          </w:p>
-        </w:tc>
       </w:tr>
       <w:tr>
         <w:tc>
           <w:tcPr>
-            <w:tcW w:type="dxa" w:w="1242"/>
+            <w:tcW w:type="dxa" w:w="1419"/>
           </w:tcPr>
           <w:p>
             <w:r>
@@ -853,7 +772,7 @@
         </w:tc>
         <w:tc>
           <w:tcPr>
-            <w:tcW w:type="dxa" w:w="1242"/>
+            <w:tcW w:type="dxa" w:w="1419"/>
           </w:tcPr>
           <w:p>
             <w:r>
@@ -863,7 +782,7 @@
         </w:tc>
         <w:tc>
           <w:tcPr>
-            <w:tcW w:type="dxa" w:w="1242"/>
+            <w:tcW w:type="dxa" w:w="1419"/>
           </w:tcPr>
           <w:p>
             <w:r>
@@ -873,7 +792,7 @@
         </w:tc>
         <w:tc>
           <w:tcPr>
-            <w:tcW w:type="dxa" w:w="1242"/>
+            <w:tcW w:type="dxa" w:w="1419"/>
           </w:tcPr>
           <w:p>
             <w:r>
@@ -883,7 +802,7 @@
         </w:tc>
         <w:tc>
           <w:tcPr>
-            <w:tcW w:type="dxa" w:w="1242"/>
+            <w:tcW w:type="dxa" w:w="1419"/>
           </w:tcPr>
           <w:p>
             <w:r>
@@ -893,31 +812,21 @@
         </w:tc>
         <w:tc>
           <w:tcPr>
-            <w:tcW w:type="dxa" w:w="1242"/>
+            <w:tcW w:type="dxa" w:w="1419"/>
           </w:tcPr>
           <w:p>
             <w:r>
-              <w:t>1.000</w:t>
+              <w:t>0.988</w:t>
             </w:r>
           </w:p>
         </w:tc>
         <w:tc>
           <w:tcPr>
-            <w:tcW w:type="dxa" w:w="1242"/>
+            <w:tcW w:type="dxa" w:w="1419"/>
           </w:tcPr>
           <w:p>
             <w:r>
               <w:t>1.213</w:t>
-            </w:r>
-          </w:p>
-        </w:tc>
-        <w:tc>
-          <w:tcPr>
-            <w:tcW w:type="dxa" w:w="1242"/>
-          </w:tcPr>
-          <w:p>
-            <w:r>
-              <w:t>2.514</w:t>
             </w:r>
           </w:p>
         </w:tc>
@@ -957,7 +866,7 @@
         <w:pStyle w:val="ListBullet"/>
       </w:pPr>
       <w:r>
-        <w:t>Keep pathway-level consistency in the benchmark permanently; it catches failures that SNR alone misses.</w:t>
+        <w:t>Keep pathway-score consistency in the benchmark permanently; it is more discriminative than top-pathway overlap with the current pathway panel.</w:t>
       </w:r>
     </w:p>
     <w:p>

</xml_diff>